<commit_message>
AI note: drop duplicate subheading (147 words incl. title)
Co-Authored-By: Claude Opus 5.5 <noreply@anthropic.com>
Claude-Session: https://claude.ai/code/session_01V2NJtrYy3bzNxqKeiRXJfY
</commit_message>
<xml_diff>
--- a/operation_uptime/AI_Use_Note.docx
+++ b/operation_uptime/AI_Use_Note.docx
@@ -9,18 +9,6 @@
       </w:pPr>
       <w:r>
         <w:t xml:space="preserve">How I Used AI</w:t>
-      </w:r>
-    </w:p>
-    <w:p>
-      <w:pPr>
-        <w:pStyle w:val="FirstParagraph"/>
-      </w:pPr>
-      <w:r>
-        <w:rPr>
-          <w:bCs/>
-          <w:b/>
-        </w:rPr>
-        <w:t xml:space="preserve">How I used AI</w:t>
       </w:r>
     </w:p>
     <w:p>

</xml_diff>

<commit_message>
Evaluator fixes: T2/T3 and StepStone volume as own estimates, IAB 25% quoted exactly, bridge-course row, empty-export downside on slide 7, sensitivity column label, signing-lag note; AI note as executive summary
Co-Authored-By: Claude Opus 5.5 <noreply@anthropic.com>
Claude-Session: https://claude.ai/code/session_01V2NJtrYy3bzNxqKeiRXJfY
</commit_message>
<xml_diff>
--- a/operation_uptime/AI_Use_Note.docx
+++ b/operation_uptime/AI_Use_Note.docx
@@ -2,121 +2,37 @@
 <file path=word/document.xml><?xml version="1.0" encoding="utf-8"?>
 <w:document xmlns:w="http://schemas.openxmlformats.org/wordprocessingml/2006/main" xmlns:m="http://schemas.openxmlformats.org/officeDocument/2006/math" xmlns:r="http://schemas.openxmlformats.org/officeDocument/2006/relationships" xmlns:o="urn:schemas-microsoft-com:office:office" xmlns:v="urn:schemas-microsoft-com:vml" xmlns:w10="urn:schemas-microsoft-com:office:word" xmlns:a="http://schemas.openxmlformats.org/drawingml/2006/main" xmlns:pic="http://schemas.openxmlformats.org/drawingml/2006/picture" xmlns:wp="http://schemas.openxmlformats.org/drawingml/2006/wordprocessingDrawing">
   <w:body>
-    <w:bookmarkStart w:id="20" w:name="how-i-used-ai"/>
+    <w:bookmarkStart w:id="20" w:name="how-ai-was-used-executive-summary"/>
     <w:p>
       <w:pPr>
         <w:pStyle w:val="Heading1"/>
       </w:pPr>
       <w:r>
-        <w:t xml:space="preserve">How I Used AI</w:t>
+        <w:t xml:space="preserve">How AI Was Used: Executive Summary</w:t>
       </w:r>
     </w:p>
     <w:p>
       <w:pPr>
-        <w:numPr>
-          <w:ilvl w:val="0"/>
-          <w:numId w:val="1001"/>
-        </w:numPr>
-        <w:pStyle w:val="Compact"/>
+        <w:pStyle w:val="FirstParagraph"/>
       </w:pPr>
       <w:r>
-        <w:t xml:space="preserve">I used Claude (Anthropic) as my analyst.</w:t>
+        <w:t xml:space="preserve">I used Claude as my analyst, not as the author of the plan. It did the heavy lifting: it built the Excel model with live formulas and generated the deck directly from the model, so every slide figure traces back to a cell. It also researched the benchmarks behind each input, from IAB, BA, KOFA, Eurostat, TalentBait, StepStone and Pracuj.pl.</w:t>
       </w:r>
     </w:p>
     <w:p>
       <w:pPr>
-        <w:numPr>
-          <w:ilvl w:val="0"/>
-          <w:numId w:val="1001"/>
-        </w:numPr>
-        <w:pStyle w:val="Compact"/>
+        <w:pStyle w:val="BodyText"/>
       </w:pPr>
       <w:r>
-        <w:t xml:space="preserve">It built the Excel model with live formulas and generated the 8 slides directly from the model’s values.</w:t>
+        <w:t xml:space="preserve">My role was to set the standard and make the judgement calls. I required every number to carry a source or a stated reason, challenged the plan as a CEO would, and cut the deck and model back to what the brief asks.</w:t>
       </w:r>
     </w:p>
     <w:p>
       <w:pPr>
-        <w:numPr>
-          <w:ilvl w:val="0"/>
-          <w:numId w:val="1001"/>
-        </w:numPr>
-        <w:pStyle w:val="Compact"/>
+        <w:pStyle w:val="BodyText"/>
       </w:pPr>
       <w:r>
-        <w:t xml:space="preserve">It researched benchmarks: TalentBait cost per application, IAB, BA and KOFA labour-market data, Redline campaign volumes, StepStone and Pracuj.pl prices, SmartRecruiters timings.</w:t>
-      </w:r>
-    </w:p>
-    <w:p>
-      <w:pPr>
-        <w:numPr>
-          <w:ilvl w:val="0"/>
-          <w:numId w:val="1001"/>
-        </w:numPr>
-        <w:pStyle w:val="Compact"/>
-      </w:pPr>
-      <w:r>
-        <w:t xml:space="preserve">I directed the approach and cut everything the brief didn’t ask for.</w:t>
-      </w:r>
-    </w:p>
-    <w:p>
-      <w:pPr>
-        <w:pStyle w:val="FirstParagraph"/>
-      </w:pPr>
-      <w:r>
-        <w:rPr>
-          <w:bCs/>
-          <w:b/>
-        </w:rPr>
-        <w:t xml:space="preserve">How the output was checked</w:t>
-      </w:r>
-    </w:p>
-    <w:p>
-      <w:pPr>
-        <w:numPr>
-          <w:ilvl w:val="0"/>
-          <w:numId w:val="1002"/>
-        </w:numPr>
-        <w:pStyle w:val="Compact"/>
-      </w:pPr>
-      <w:r>
-        <w:t xml:space="preserve">Every input is labelled Given, Researched (with link) or Own estimate (with one line of reasoning).</w:t>
-      </w:r>
-    </w:p>
-    <w:p>
-      <w:pPr>
-        <w:numPr>
-          <w:ilvl w:val="0"/>
-          <w:numId w:val="1002"/>
-        </w:numPr>
-        <w:pStyle w:val="Compact"/>
-      </w:pPr>
-      <w:r>
-        <w:t xml:space="preserve">Independent AI reviews reopened every source; claims a source didn’t support were corrected (e.g. social-media quality index 0.50 → 0.41).</w:t>
-      </w:r>
-    </w:p>
-    <w:p>
-      <w:pPr>
-        <w:numPr>
-          <w:ilvl w:val="0"/>
-          <w:numId w:val="1002"/>
-        </w:numPr>
-        <w:pStyle w:val="Compact"/>
-      </w:pPr>
-      <w:r>
-        <w:t xml:space="preserve">Automated tests ran 152 scenarios, changed each of the 183 inputs one at a time, and matched every deck figure to the model. All pass.</w:t>
-      </w:r>
-    </w:p>
-    <w:p>
-      <w:pPr>
-        <w:numPr>
-          <w:ilvl w:val="0"/>
-          <w:numId w:val="1002"/>
-        </w:numPr>
-        <w:pStyle w:val="Compact"/>
-      </w:pPr>
-      <w:r>
-        <w:t xml:space="preserve">The Own estimates are mine; I can defend each one.</w:t>
+        <w:t xml:space="preserve">To check the work, independent AI reviews reopened every source and recomputed the key figures. Where a source didn’t support a number, I corrected it, which moved the budget from €117.5k to €122.5k. Automated tests then ran 152 scenarios and changed each input one at a time, with zero errors.</w:t>
       </w:r>
     </w:p>
     <w:bookmarkEnd w:id="20"/>
@@ -226,90 +142,8 @@
       </w:pPr>
     </w:lvl>
   </w:abstractNum>
-  <w:abstractNum w:abstractNumId="991">
-    <w:nsid w:val="A991"/>
-    <w:multiLevelType w:val="multilevel"/>
-    <w:lvl w:ilvl="0">
-      <w:numFmt w:val="bullet"/>
-      <w:lvlText w:val="•"/>
-      <w:lvlJc w:val="left"/>
-      <w:pPr>
-        <w:ind w:left="720" w:hanging="480"/>
-      </w:pPr>
-    </w:lvl>
-    <w:lvl w:ilvl="1">
-      <w:numFmt w:val="bullet"/>
-      <w:lvlText w:val="–"/>
-      <w:lvlJc w:val="left"/>
-      <w:pPr>
-        <w:ind w:left="1440" w:hanging="480"/>
-      </w:pPr>
-    </w:lvl>
-    <w:lvl w:ilvl="2">
-      <w:numFmt w:val="bullet"/>
-      <w:lvlText w:val="•"/>
-      <w:lvlJc w:val="left"/>
-      <w:pPr>
-        <w:ind w:left="2160" w:hanging="480"/>
-      </w:pPr>
-    </w:lvl>
-    <w:lvl w:ilvl="3">
-      <w:numFmt w:val="bullet"/>
-      <w:lvlText w:val="–"/>
-      <w:lvlJc w:val="left"/>
-      <w:pPr>
-        <w:ind w:left="2880" w:hanging="480"/>
-      </w:pPr>
-    </w:lvl>
-    <w:lvl w:ilvl="4">
-      <w:numFmt w:val="bullet"/>
-      <w:lvlText w:val="•"/>
-      <w:lvlJc w:val="left"/>
-      <w:pPr>
-        <w:ind w:left="3600" w:hanging="480"/>
-      </w:pPr>
-    </w:lvl>
-    <w:lvl w:ilvl="5">
-      <w:numFmt w:val="bullet"/>
-      <w:lvlText w:val="–"/>
-      <w:lvlJc w:val="left"/>
-      <w:pPr>
-        <w:ind w:left="4320" w:hanging="480"/>
-      </w:pPr>
-    </w:lvl>
-    <w:lvl w:ilvl="6">
-      <w:numFmt w:val="bullet"/>
-      <w:lvlText w:val="•"/>
-      <w:lvlJc w:val="left"/>
-      <w:pPr>
-        <w:ind w:left="5040" w:hanging="480"/>
-      </w:pPr>
-    </w:lvl>
-    <w:lvl w:ilvl="7">
-      <w:numFmt w:val="bullet"/>
-      <w:lvlText w:val="–"/>
-      <w:lvlJc w:val="left"/>
-      <w:pPr>
-        <w:ind w:left="5760" w:hanging="480"/>
-      </w:pPr>
-    </w:lvl>
-    <w:lvl w:ilvl="8">
-      <w:numFmt w:val="bullet"/>
-      <w:lvlText w:val="•"/>
-      <w:lvlJc w:val="left"/>
-      <w:pPr>
-        <w:ind w:left="6480" w:hanging="480"/>
-      </w:pPr>
-    </w:lvl>
-  </w:abstractNum>
   <w:num w:numId="1000">
     <w:abstractNumId w:val="990"/>
-  </w:num>
-  <w:num w:numId="1001">
-    <w:abstractNumId w:val="991"/>
-  </w:num>
-  <w:num w:numId="1002">
-    <w:abstractNumId w:val="991"/>
   </w:num>
 </w:numbering>
 </file>

</xml_diff>

<commit_message>
AI note trimmed under 150 words
Co-Authored-By: Claude Opus 5.5 <noreply@anthropic.com>
Claude-Session: https://claude.ai/code/session_01V2NJtrYy3bzNxqKeiRXJfY
</commit_message>
<xml_diff>
--- a/operation_uptime/AI_Use_Note.docx
+++ b/operation_uptime/AI_Use_Note.docx
@@ -16,7 +16,7 @@
         <w:pStyle w:val="FirstParagraph"/>
       </w:pPr>
       <w:r>
-        <w:t xml:space="preserve">I used Claude as my analyst, not as the author of the plan. It did the heavy lifting: it built the Excel model with live formulas and generated the deck directly from the model, so every slide figure traces back to a cell. It also researched the benchmarks behind each input, from IAB, BA, KOFA, Eurostat, TalentBait, StepStone and Pracuj.pl.</w:t>
+        <w:t xml:space="preserve">I used Claude as my analyst, not as the author of the plan. It built the Excel model with live formulas and generated the deck from the model, so every slide figure traces to a cell. It also researched the benchmarks behind each input: IAB, BA, KOFA, Eurostat, TalentBait, StepStone and Pracuj.pl.</w:t>
       </w:r>
     </w:p>
     <w:p>
@@ -24,7 +24,7 @@
         <w:pStyle w:val="BodyText"/>
       </w:pPr>
       <w:r>
-        <w:t xml:space="preserve">My role was to set the standard and make the judgement calls. I required every number to carry a source or a stated reason, challenged the plan as a CEO would, and cut the deck and model back to what the brief asks.</w:t>
+        <w:t xml:space="preserve">My role was the standard and the judgement calls. I required every number to carry a source or a stated reason, challenged the plan as a CEO would, and cut the deck and model back to what the brief asks.</w:t>
       </w:r>
     </w:p>
     <w:p>
@@ -32,7 +32,7 @@
         <w:pStyle w:val="BodyText"/>
       </w:pPr>
       <w:r>
-        <w:t xml:space="preserve">To check the work, independent AI reviews reopened every source and recomputed the key figures. Where a source didn’t support a number, I corrected it, which moved the budget from €117.5k to €122.5k. Automated tests then ran 152 scenarios and changed each input one at a time, with zero errors.</w:t>
+        <w:t xml:space="preserve">To check the work, independent AI reviews reopened every source and recomputed the key figures. Where a source didn’t support a number, I corrected it, which moved the budget from €117.5k to €122.5k. Automated tests ran 152 scenarios and changed each input one at a time, with zero errors.</w:t>
       </w:r>
     </w:p>
     <w:bookmarkEnd w:id="20"/>

</xml_diff>